<commit_message>
Add reference-based cover and remove title border in Lab 8 report
</commit_message>
<xml_diff>
--- a/docs/commercial/lz8-enuway-sow-sla-budget.docx
+++ b/docs/commercial/lz8-enuway-sow-sla-budget.docx
@@ -2,6 +2,666 @@
 <file path=word/document.xml><?xml version="1.0" encoding="utf-8"?>
 <w:document xmlns:wpc="http://schemas.microsoft.com/office/word/2010/wordprocessingCanvas" xmlns:mo="http://schemas.microsoft.com/office/mac/office/2008/main" xmlns:mc="http://schemas.openxmlformats.org/markup-compatibility/2006" xmlns:mv="urn:schemas-microsoft-com:mac:vml" xmlns:o="urn:schemas-microsoft-com:office:office" xmlns:r="http://schemas.openxmlformats.org/officeDocument/2006/relationships" xmlns:m="http://schemas.openxmlformats.org/officeDocument/2006/math" xmlns:v="urn:schemas-microsoft-com:vml" xmlns:wp14="http://schemas.microsoft.com/office/word/2010/wordprocessingDrawing" xmlns:wp="http://schemas.openxmlformats.org/drawingml/2006/wordprocessingDrawing" xmlns:w10="urn:schemas-microsoft-com:office:word" xmlns:w="http://schemas.openxmlformats.org/wordprocessingml/2006/main" xmlns:w14="http://schemas.microsoft.com/office/word/2010/wordml" xmlns:wpg="http://schemas.microsoft.com/office/word/2010/wordprocessingGroup" xmlns:wpi="http://schemas.microsoft.com/office/word/2010/wordprocessingInk" xmlns:wne="http://schemas.microsoft.com/office/word/2006/wordml" xmlns:wps="http://schemas.microsoft.com/office/word/2010/wordprocessingShape" mc:Ignorable="w14 wp14">
   <w:body>
+    <w:p>
+      <w:pPr>
+        <w:jc w:val="center"/>
+        <w:rPr>
+          <w:b/>
+          <w:sz w:val="28"/>
+          <w:szCs w:val="28"/>
+          <w:lang w:val="ru-RU"/>
+        </w:rPr>
+        <w:spacing w:before="0" w:after="0" w:line="240" w:lineRule="auto"/>
+        <w:ind w:firstLine="0" w:left="0" w:right="0"/>
+      </w:pPr>
+      <w:r>
+        <w:rPr>
+          <w:b/>
+          <w:rFonts w:ascii="Times New Roman" w:hAnsi="Times New Roman" w:cs="Times New Roman" w:eastAsia="Times New Roman"/>
+          <w:sz w:val="28"/>
+          <w:szCs w:val="28"/>
+        </w:rPr>
+        <w:t>ҚАЗАҚСТАН РЕСПУБЛИКАСЫ БІЛІМ ЖӘНЕ ҒЫЛЫМ МИНИСТІРЛІГІ</w:t>
+      </w:r>
+    </w:p>
+    <w:p>
+      <w:pPr>
+        <w:jc w:val="center"/>
+        <w:rPr>
+          <w:b/>
+          <w:sz w:val="28"/>
+          <w:szCs w:val="28"/>
+          <w:lang w:val="ru-RU"/>
+        </w:rPr>
+        <w:spacing w:before="0" w:after="0" w:line="240" w:lineRule="auto"/>
+        <w:ind w:firstLine="0" w:left="0" w:right="0"/>
+      </w:pPr>
+    </w:p>
+    <w:p>
+      <w:pPr>
+        <w:jc w:val="center"/>
+        <w:rPr>
+          <w:b/>
+          <w:sz w:val="28"/>
+          <w:szCs w:val="28"/>
+        </w:rPr>
+        <w:spacing w:before="0" w:after="0" w:line="240" w:lineRule="auto"/>
+        <w:ind w:firstLine="0" w:left="0" w:right="0"/>
+      </w:pPr>
+      <w:r>
+        <w:rPr>
+          <w:b/>
+          <w:rFonts w:ascii="Times New Roman" w:hAnsi="Times New Roman" w:cs="Times New Roman" w:eastAsia="Times New Roman"/>
+          <w:sz w:val="28"/>
+          <w:szCs w:val="28"/>
+        </w:rPr>
+        <w:t>Л.Н.Гумилев атындағы Еуразия ұлттық университеті</w:t>
+      </w:r>
+    </w:p>
+    <w:p>
+      <w:pPr>
+        <w:jc w:val="center"/>
+        <w:rPr>
+          <w:b/>
+          <w:sz w:val="28"/>
+          <w:szCs w:val="28"/>
+        </w:rPr>
+        <w:spacing w:before="0" w:after="0" w:line="240" w:lineRule="auto"/>
+        <w:ind w:firstLine="0" w:left="0" w:right="0"/>
+      </w:pPr>
+      <w:r>
+        <w:rPr>
+          <w:b/>
+          <w:rFonts w:ascii="Times New Roman" w:hAnsi="Times New Roman" w:cs="Times New Roman" w:eastAsia="Times New Roman"/>
+          <w:sz w:val="28"/>
+          <w:szCs w:val="28"/>
+        </w:rPr>
+        <w:t xml:space="preserve">Ақпараттық технологиялар факультеті </w:t>
+      </w:r>
+    </w:p>
+    <w:p>
+      <w:pPr>
+        <w:jc w:val="center"/>
+        <w:rPr>
+          <w:b/>
+          <w:sz w:val="28"/>
+          <w:szCs w:val="28"/>
+        </w:rPr>
+        <w:spacing w:before="0" w:after="0" w:line="240" w:lineRule="auto"/>
+        <w:ind w:firstLine="0" w:left="0" w:right="0"/>
+      </w:pPr>
+      <w:r>
+        <w:rPr>
+          <w:b/>
+          <w:rFonts w:ascii="Times New Roman" w:hAnsi="Times New Roman" w:cs="Times New Roman" w:eastAsia="Times New Roman"/>
+          <w:sz w:val="28"/>
+          <w:szCs w:val="28"/>
+        </w:rPr>
+        <w:t>Ақпараттық жүйелер кафедрасы</w:t>
+      </w:r>
+    </w:p>
+    <w:p>
+      <w:pPr>
+        <w:jc w:val="center"/>
+        <w:rPr>
+          <w:b/>
+          <w:bCs/>
+          <w:sz w:val="28"/>
+          <w:szCs w:val="28"/>
+        </w:rPr>
+        <w:spacing w:before="0" w:after="0" w:line="240" w:lineRule="auto"/>
+        <w:ind w:firstLine="0" w:left="0" w:right="0"/>
+      </w:pPr>
+    </w:p>
+    <w:p>
+      <w:pPr>
+        <w:jc w:val="center"/>
+        <w:rPr>
+          <w:b/>
+          <w:bCs/>
+          <w:sz w:val="28"/>
+          <w:szCs w:val="28"/>
+        </w:rPr>
+        <w:spacing w:before="0" w:after="0" w:line="240" w:lineRule="auto"/>
+        <w:ind w:firstLine="0" w:left="0" w:right="0"/>
+      </w:pPr>
+    </w:p>
+    <w:p>
+      <w:pPr>
+        <w:jc w:val="center"/>
+        <w:rPr>
+          <w:b/>
+          <w:bCs/>
+          <w:sz w:val="28"/>
+          <w:szCs w:val="28"/>
+        </w:rPr>
+        <w:spacing w:before="0" w:after="0" w:line="240" w:lineRule="auto"/>
+        <w:ind w:firstLine="0" w:left="0" w:right="0"/>
+      </w:pPr>
+    </w:p>
+    <w:p>
+      <w:pPr>
+        <w:tabs>
+          <w:tab w:val="left" w:pos="4149"/>
+        </w:tabs>
+        <w:rPr>
+          <w:b/>
+          <w:bCs/>
+          <w:sz w:val="28"/>
+          <w:szCs w:val="28"/>
+        </w:rPr>
+        <w:spacing w:before="0" w:after="0" w:line="240" w:lineRule="auto"/>
+        <w:ind w:firstLine="0" w:left="0" w:right="0"/>
+      </w:pPr>
+      <w:r>
+        <w:rPr>
+          <w:b/>
+          <w:bCs/>
+          <w:rFonts w:ascii="Times New Roman" w:hAnsi="Times New Roman" w:cs="Times New Roman" w:eastAsia="Times New Roman"/>
+          <w:sz w:val="28"/>
+          <w:szCs w:val="28"/>
+        </w:rPr>
+        <w:tab/>
+      </w:r>
+    </w:p>
+    <w:p>
+      <w:pPr>
+        <w:jc w:val="center"/>
+        <w:rPr>
+          <w:b/>
+          <w:bCs/>
+          <w:sz w:val="28"/>
+          <w:szCs w:val="28"/>
+        </w:rPr>
+        <w:spacing w:before="0" w:after="0" w:line="240" w:lineRule="auto"/>
+        <w:ind w:firstLine="0" w:left="0" w:right="0"/>
+      </w:pPr>
+    </w:p>
+    <w:p>
+      <w:pPr>
+        <w:tabs>
+          <w:tab w:val="left" w:pos="2412"/>
+        </w:tabs>
+        <w:rPr>
+          <w:b/>
+          <w:bCs/>
+          <w:sz w:val="28"/>
+          <w:szCs w:val="28"/>
+        </w:rPr>
+        <w:spacing w:before="0" w:after="0" w:line="240" w:lineRule="auto"/>
+        <w:ind w:firstLine="0" w:left="0" w:right="0"/>
+      </w:pPr>
+      <w:r>
+        <w:rPr>
+          <w:b/>
+          <w:bCs/>
+          <w:rFonts w:ascii="Times New Roman" w:hAnsi="Times New Roman" w:cs="Times New Roman" w:eastAsia="Times New Roman"/>
+          <w:sz w:val="28"/>
+          <w:szCs w:val="28"/>
+        </w:rPr>
+        <w:tab/>
+      </w:r>
+    </w:p>
+    <w:p>
+      <w:pPr>
+        <w:jc w:val="center"/>
+        <w:rPr>
+          <w:b/>
+          <w:bCs/>
+          <w:sz w:val="28"/>
+          <w:szCs w:val="28"/>
+        </w:rPr>
+        <w:spacing w:before="0" w:after="0" w:line="240" w:lineRule="auto"/>
+        <w:ind w:firstLine="0" w:left="0" w:right="0"/>
+      </w:pPr>
+    </w:p>
+    <w:p>
+      <w:pPr>
+        <w:jc w:val="center"/>
+        <w:rPr>
+          <w:b/>
+          <w:bCs/>
+          <w:sz w:val="28"/>
+          <w:szCs w:val="28"/>
+        </w:rPr>
+        <w:spacing w:before="0" w:after="0" w:line="240" w:lineRule="auto"/>
+        <w:ind w:firstLine="0" w:left="0" w:right="0"/>
+      </w:pPr>
+    </w:p>
+    <w:p>
+      <w:pPr>
+        <w:jc w:val="center"/>
+        <w:rPr>
+          <w:b/>
+          <w:bCs/>
+          <w:sz w:val="28"/>
+          <w:szCs w:val="28"/>
+        </w:rPr>
+        <w:spacing w:before="0" w:after="0" w:line="240" w:lineRule="auto"/>
+        <w:ind w:firstLine="0" w:left="0" w:right="0"/>
+      </w:pPr>
+      <w:r>
+        <w:rPr>
+          <w:b/>
+          <w:bCs/>
+          <w:rFonts w:ascii="Times New Roman" w:hAnsi="Times New Roman" w:cs="Times New Roman" w:eastAsia="Times New Roman"/>
+          <w:sz w:val="28"/>
+          <w:szCs w:val="28"/>
+        </w:rPr>
+        <w:t>ЕСЕП</w:t>
+      </w:r>
+    </w:p>
+    <w:p>
+      <w:pPr>
+        <w:jc w:val="center"/>
+        <w:rPr>
+          <w:b/>
+          <w:bCs/>
+          <w:sz w:val="28"/>
+          <w:szCs w:val="28"/>
+          <w:lang w:val="en-US"/>
+        </w:rPr>
+        <w:spacing w:before="0" w:after="0" w:line="240" w:lineRule="auto"/>
+        <w:ind w:firstLine="0" w:left="0" w:right="0"/>
+      </w:pPr>
+      <w:r>
+        <w:rPr>
+          <w:b/>
+          <w:rFonts w:ascii="Times New Roman" w:hAnsi="Times New Roman" w:cs="Times New Roman" w:eastAsia="Times New Roman"/>
+          <w:sz w:val="28"/>
+          <w:szCs w:val="28"/>
+        </w:rPr>
+        <w:t>ЗЕРТХАНАЛЫҚ ЖҰМЫС №8</w:t>
+      </w:r>
+    </w:p>
+    <w:p>
+      <w:pPr>
+        <w:jc w:val="center"/>
+        <w:rPr>
+          <w:b/>
+          <w:bCs/>
+          <w:sz w:val="28"/>
+          <w:szCs w:val="28"/>
+        </w:rPr>
+        <w:spacing w:before="0" w:after="0" w:line="240" w:lineRule="auto"/>
+        <w:ind w:firstLine="0" w:left="0" w:right="0"/>
+      </w:pPr>
+    </w:p>
+    <w:p>
+      <w:pPr>
+        <w:jc w:val="center"/>
+        <w:rPr>
+          <w:b/>
+          <w:bCs/>
+          <w:sz w:val="28"/>
+          <w:szCs w:val="28"/>
+        </w:rPr>
+        <w:spacing w:before="0" w:after="0" w:line="240" w:lineRule="auto"/>
+        <w:ind w:firstLine="0" w:left="0" w:right="0"/>
+      </w:pPr>
+      <w:r>
+        <w:rPr>
+          <w:b/>
+          <w:rFonts w:ascii="Times New Roman" w:hAnsi="Times New Roman" w:cs="Times New Roman" w:eastAsia="Times New Roman"/>
+          <w:sz w:val="28"/>
+          <w:szCs w:val="28"/>
+        </w:rPr>
+        <w:t>Пән: IT жобаларын басқару</w:t>
+      </w:r>
+    </w:p>
+    <w:p>
+      <w:pPr>
+        <w:jc w:val="center"/>
+        <w:rPr>
+          <w:sz w:val="28"/>
+          <w:szCs w:val="28"/>
+        </w:rPr>
+        <w:spacing w:before="0" w:after="0" w:line="240" w:lineRule="auto"/>
+        <w:ind w:firstLine="0" w:left="0" w:right="0"/>
+      </w:pPr>
+    </w:p>
+    <w:p>
+      <w:pPr>
+        <w:jc w:val="center"/>
+        <w:rPr>
+          <w:sz w:val="28"/>
+          <w:szCs w:val="28"/>
+        </w:rPr>
+        <w:spacing w:before="0" w:after="0" w:line="240" w:lineRule="auto"/>
+        <w:ind w:firstLine="0" w:left="0" w:right="0"/>
+      </w:pPr>
+    </w:p>
+    <w:p>
+      <w:pPr>
+        <w:jc w:val="center"/>
+        <w:rPr>
+          <w:sz w:val="28"/>
+          <w:szCs w:val="28"/>
+        </w:rPr>
+        <w:spacing w:before="0" w:after="0" w:line="240" w:lineRule="auto"/>
+        <w:ind w:firstLine="0" w:left="0" w:right="0"/>
+      </w:pPr>
+    </w:p>
+    <w:p>
+      <w:pPr>
+        <w:jc w:val="center"/>
+        <w:rPr>
+          <w:b/>
+          <w:bCs/>
+          <w:sz w:val="28"/>
+          <w:szCs w:val="28"/>
+          <w:lang w:val="en-US"/>
+        </w:rPr>
+        <w:spacing w:before="0" w:after="0" w:line="240" w:lineRule="auto"/>
+        <w:ind w:firstLine="0" w:left="0" w:right="0"/>
+      </w:pPr>
+      <w:r>
+        <w:rPr>
+          <w:b/>
+          <w:rFonts w:ascii="Times New Roman" w:hAnsi="Times New Roman" w:cs="Times New Roman" w:eastAsia="Times New Roman"/>
+          <w:sz w:val="28"/>
+          <w:szCs w:val="28"/>
+        </w:rPr>
+        <w:t>Тақырыбы: «ENUWay жобасының SoW, SLA және SLO талаптары мен бюджеті»</w:t>
+      </w:r>
+    </w:p>
+    <w:p>
+      <w:pPr>
+        <w:jc w:val="center"/>
+        <w:rPr>
+          <w:sz w:val="28"/>
+          <w:szCs w:val="28"/>
+        </w:rPr>
+        <w:spacing w:before="0" w:after="0" w:line="240" w:lineRule="auto"/>
+        <w:ind w:firstLine="0" w:left="0" w:right="0"/>
+      </w:pPr>
+    </w:p>
+    <w:p>
+      <w:pPr>
+        <w:jc w:val="right"/>
+        <w:rPr>
+          <w:sz w:val="28"/>
+          <w:szCs w:val="28"/>
+        </w:rPr>
+        <w:spacing w:before="0" w:after="0" w:line="240" w:lineRule="auto"/>
+        <w:ind w:firstLine="0" w:left="0" w:right="0"/>
+      </w:pPr>
+    </w:p>
+    <w:p>
+      <w:pPr>
+        <w:jc w:val="right"/>
+        <w:rPr>
+          <w:sz w:val="28"/>
+          <w:szCs w:val="28"/>
+        </w:rPr>
+        <w:spacing w:before="0" w:after="0" w:line="240" w:lineRule="auto"/>
+        <w:ind w:firstLine="0" w:left="0" w:right="0"/>
+      </w:pPr>
+    </w:p>
+    <w:p>
+      <w:pPr>
+        <w:jc w:val="right"/>
+        <w:rPr>
+          <w:sz w:val="28"/>
+          <w:szCs w:val="28"/>
+        </w:rPr>
+        <w:spacing w:before="0" w:after="0" w:line="240" w:lineRule="auto"/>
+        <w:ind w:firstLine="0" w:left="0" w:right="0"/>
+      </w:pPr>
+    </w:p>
+    <w:p>
+      <w:pPr>
+        <w:jc w:val="right"/>
+        <w:rPr>
+          <w:sz w:val="28"/>
+          <w:szCs w:val="28"/>
+        </w:rPr>
+        <w:spacing w:before="0" w:after="0" w:line="240" w:lineRule="auto"/>
+        <w:ind w:firstLine="0" w:left="0" w:right="0"/>
+      </w:pPr>
+    </w:p>
+    <w:p>
+      <w:pPr>
+        <w:jc w:val="right"/>
+        <w:rPr>
+          <w:sz w:val="28"/>
+          <w:szCs w:val="28"/>
+        </w:rPr>
+        <w:spacing w:before="0" w:after="0" w:line="240" w:lineRule="auto"/>
+        <w:ind w:firstLine="0" w:left="0" w:right="0"/>
+      </w:pPr>
+    </w:p>
+    <w:p>
+      <w:pPr>
+        <w:jc w:val="right"/>
+        <w:rPr>
+          <w:sz w:val="28"/>
+          <w:szCs w:val="28"/>
+        </w:rPr>
+        <w:spacing w:before="0" w:after="0" w:line="240" w:lineRule="auto"/>
+        <w:ind w:firstLine="0" w:left="0" w:right="0"/>
+      </w:pPr>
+      <w:r>
+        <w:rPr>
+          <w:rFonts w:ascii="Times New Roman" w:hAnsi="Times New Roman" w:cs="Times New Roman" w:eastAsia="Times New Roman"/>
+          <w:sz w:val="28"/>
+          <w:szCs w:val="28"/>
+        </w:rPr>
+        <w:t>Орындағандар: Альфараби, Нурай, Нурислам</w:t>
+      </w:r>
+    </w:p>
+    <w:p>
+      <w:pPr>
+        <w:jc w:val="right"/>
+        <w:rPr>
+          <w:sz w:val="28"/>
+          <w:szCs w:val="28"/>
+        </w:rPr>
+        <w:spacing w:before="0" w:after="0" w:line="240" w:lineRule="auto"/>
+        <w:ind w:firstLine="0" w:left="0" w:right="0"/>
+      </w:pPr>
+      <w:r>
+        <w:rPr>
+          <w:rFonts w:ascii="Times New Roman" w:hAnsi="Times New Roman" w:cs="Times New Roman" w:eastAsia="Times New Roman"/>
+          <w:sz w:val="28"/>
+          <w:szCs w:val="28"/>
+        </w:rPr>
+        <w:t xml:space="preserve">Тобы: </w:t>
+      </w:r>
+      <w:r>
+        <w:rPr>
+          <w:u w:val="single"/>
+          <w:rFonts w:ascii="Times New Roman" w:hAnsi="Times New Roman" w:cs="Times New Roman" w:eastAsia="Times New Roman"/>
+          <w:sz w:val="28"/>
+          <w:szCs w:val="28"/>
+        </w:rPr>
+        <w:t>АЖ - 45</w:t>
+      </w:r>
+    </w:p>
+    <w:p>
+      <w:pPr>
+        <w:jc w:val="right"/>
+        <w:rPr>
+          <w:sz w:val="28"/>
+          <w:szCs w:val="28"/>
+          <w:u w:val="single"/>
+        </w:rPr>
+        <w:spacing w:before="0" w:after="0" w:line="240" w:lineRule="auto"/>
+        <w:ind w:firstLine="0" w:left="0" w:right="0"/>
+      </w:pPr>
+      <w:r>
+        <w:rPr>
+          <w:rFonts w:ascii="Times New Roman" w:hAnsi="Times New Roman" w:cs="Times New Roman" w:eastAsia="Times New Roman"/>
+          <w:sz w:val="28"/>
+          <w:szCs w:val="28"/>
+        </w:rPr>
+        <w:t>Тексерген: Самбетбаева М.А.</w:t>
+      </w:r>
+    </w:p>
+    <w:p>
+      <w:pPr>
+        <w:jc w:val="center"/>
+        <w:rPr>
+          <w:b/>
+          <w:bCs/>
+          <w:sz w:val="28"/>
+          <w:szCs w:val="28"/>
+        </w:rPr>
+        <w:spacing w:before="0" w:after="0" w:line="240" w:lineRule="auto"/>
+        <w:ind w:firstLine="0" w:left="0" w:right="0"/>
+      </w:pPr>
+    </w:p>
+    <w:p>
+      <w:pPr>
+        <w:jc w:val="center"/>
+        <w:rPr>
+          <w:b/>
+          <w:bCs/>
+          <w:sz w:val="28"/>
+          <w:szCs w:val="28"/>
+        </w:rPr>
+        <w:spacing w:before="0" w:after="0" w:line="240" w:lineRule="auto"/>
+        <w:ind w:firstLine="0" w:left="0" w:right="0"/>
+      </w:pPr>
+    </w:p>
+    <w:p>
+      <w:pPr>
+        <w:jc w:val="center"/>
+        <w:rPr>
+          <w:b/>
+          <w:bCs/>
+          <w:sz w:val="28"/>
+          <w:szCs w:val="28"/>
+        </w:rPr>
+        <w:spacing w:before="0" w:after="0" w:line="240" w:lineRule="auto"/>
+        <w:ind w:firstLine="0" w:left="0" w:right="0"/>
+      </w:pPr>
+    </w:p>
+    <w:p>
+      <w:pPr>
+        <w:jc w:val="center"/>
+        <w:rPr>
+          <w:b/>
+          <w:bCs/>
+          <w:sz w:val="28"/>
+          <w:szCs w:val="28"/>
+        </w:rPr>
+        <w:spacing w:before="0" w:after="0" w:line="240" w:lineRule="auto"/>
+        <w:ind w:firstLine="0" w:left="0" w:right="0"/>
+      </w:pPr>
+    </w:p>
+    <w:p>
+      <w:pPr>
+        <w:jc w:val="center"/>
+        <w:rPr>
+          <w:b/>
+          <w:bCs/>
+          <w:sz w:val="28"/>
+          <w:szCs w:val="28"/>
+        </w:rPr>
+        <w:spacing w:before="0" w:after="0" w:line="240" w:lineRule="auto"/>
+        <w:ind w:firstLine="0" w:left="0" w:right="0"/>
+      </w:pPr>
+    </w:p>
+    <w:p>
+      <w:pPr>
+        <w:jc w:val="center"/>
+        <w:rPr>
+          <w:b/>
+          <w:bCs/>
+          <w:sz w:val="28"/>
+          <w:szCs w:val="28"/>
+        </w:rPr>
+        <w:spacing w:before="0" w:after="0" w:line="240" w:lineRule="auto"/>
+        <w:ind w:firstLine="0" w:left="0" w:right="0"/>
+      </w:pPr>
+    </w:p>
+    <w:p>
+      <w:pPr>
+        <w:jc w:val="center"/>
+        <w:rPr>
+          <w:b/>
+          <w:bCs/>
+          <w:sz w:val="28"/>
+          <w:szCs w:val="28"/>
+        </w:rPr>
+        <w:spacing w:before="0" w:after="0" w:line="240" w:lineRule="auto"/>
+        <w:ind w:firstLine="0" w:left="0" w:right="0"/>
+      </w:pPr>
+    </w:p>
+    <w:p>
+      <w:pPr>
+        <w:rPr>
+          <w:b/>
+          <w:bCs/>
+          <w:sz w:val="28"/>
+          <w:szCs w:val="28"/>
+        </w:rPr>
+        <w:spacing w:before="0" w:after="0" w:line="240" w:lineRule="auto"/>
+        <w:ind w:firstLine="0" w:left="0" w:right="0"/>
+      </w:pPr>
+    </w:p>
+    <w:p>
+      <w:pPr>
+        <w:rPr>
+          <w:b/>
+          <w:bCs/>
+          <w:sz w:val="28"/>
+          <w:szCs w:val="28"/>
+          <w:lang w:val="en-US"/>
+        </w:rPr>
+        <w:spacing w:before="0" w:after="0" w:line="240" w:lineRule="auto"/>
+        <w:ind w:firstLine="0" w:left="0" w:right="0"/>
+      </w:pPr>
+    </w:p>
+    <w:p>
+      <w:pPr>
+        <w:rPr>
+          <w:b/>
+          <w:bCs/>
+          <w:sz w:val="28"/>
+          <w:szCs w:val="28"/>
+          <w:lang w:val="en-US"/>
+        </w:rPr>
+        <w:spacing w:before="0" w:after="0" w:line="240" w:lineRule="auto"/>
+        <w:ind w:firstLine="0" w:left="0" w:right="0"/>
+      </w:pPr>
+    </w:p>
+    <w:p>
+      <w:pPr>
+        <w:jc w:val="center"/>
+        <w:rPr>
+          <w:b/>
+          <w:bCs/>
+          <w:sz w:val="28"/>
+          <w:szCs w:val="28"/>
+        </w:rPr>
+        <w:spacing w:before="0" w:after="0" w:line="240" w:lineRule="auto"/>
+        <w:ind w:firstLine="0" w:left="0" w:right="0"/>
+      </w:pPr>
+      <w:r>
+        <w:rPr>
+          <w:b/>
+          <w:bCs/>
+          <w:rFonts w:ascii="Times New Roman" w:hAnsi="Times New Roman" w:cs="Times New Roman" w:eastAsia="Times New Roman"/>
+          <w:sz w:val="28"/>
+          <w:szCs w:val="28"/>
+        </w:rPr>
+        <w:t>2026 жыл</w:t>
+      </w:r>
+    </w:p>
+    <w:p>
+      <w:pPr>
+        <w:spacing w:before="0" w:after="0" w:line="20" w:lineRule="exact"/>
+        <w:sectPr>
+          <w:type w:val="nextPage"/>
+          <w:pgSz w:w="11906" w:h="16838"/>
+          <w:pgMar w:top="1418" w:right="850" w:bottom="1418" w:left="1701" w:header="708" w:footer="708" w:gutter="0"/>
+          <w:cols w:space="720"/>
+          <w:docGrid w:linePitch="360"/>
+        </w:sectPr>
+      </w:pPr>
+    </w:p>
     <w:p>
       <w:pPr>
         <w:pStyle w:val="Title"/>
@@ -4796,9 +5456,6 @@
     <w:qFormat/>
     <w:rsid w:val="00FC693F"/>
     <w:pPr>
-      <w:pBdr>
-        <w:bottom w:val="single" w:sz="8" w:space="4" w:color="4F81BD" w:themeColor="accent1"/>
-      </w:pBdr>
       <w:spacing w:after="120" w:line="360" w:lineRule="auto"/>
       <w:contextualSpacing/>
     </w:pPr>

</xml_diff>